<commit_message>
Se agrega Introducción y Alcance
</commit_message>
<xml_diff>
--- a/Ej Empresa Fúnebre ESRE-APF_Morelli Rodrigo.docx
+++ b/Ej Empresa Fúnebre ESRE-APF_Morelli Rodrigo.docx
@@ -130,11 +130,6 @@
     </w:p>
     <w:p>
       <w:pPr>
-        <w:pStyle w:val="Prrafodelista"/>
-        <w:numPr>
-          <w:ilvl w:val="0"/>
-          <w:numId w:val="5"/>
-        </w:numPr>
         <w:spacing w:line="360" w:lineRule="auto"/>
         <w:jc w:val="both"/>
         <w:rPr>
@@ -153,9 +148,62 @@
           <w:sz w:val="24"/>
           <w:szCs w:val="24"/>
         </w:rPr>
-        <w:t>Alcance</w:t>
-      </w:r>
-      <w:r>
+        <w:t>Introducción</w:t>
+      </w:r>
+    </w:p>
+    <w:p>
+      <w:pPr>
+        <w:spacing w:line="360" w:lineRule="auto"/>
+        <w:jc w:val="both"/>
+        <w:rPr>
+          <w:rFonts w:ascii="Arial" w:hAnsi="Arial" w:cs="Arial"/>
+          <w:sz w:val="24"/>
+          <w:szCs w:val="24"/>
+        </w:rPr>
+      </w:pPr>
+      <w:r>
+        <w:rPr>
+          <w:rFonts w:ascii="Arial" w:hAnsi="Arial" w:cs="Arial"/>
+          <w:sz w:val="24"/>
+          <w:szCs w:val="24"/>
+        </w:rPr>
+        <w:t>La empresa fúnebre "El Buen Descanso" requiere un sistema informático que permita administrar de forma eficiente la información de sus socios y los servicios que ofrece. Actualmente, muchos de los procesos se realizan de manera manual, lo que dificulta el control de la información y aumenta la posibilidad de errores.</w:t>
+      </w:r>
+    </w:p>
+    <w:p>
+      <w:pPr>
+        <w:spacing w:line="360" w:lineRule="auto"/>
+        <w:jc w:val="both"/>
+        <w:rPr>
+          <w:rFonts w:ascii="Arial" w:hAnsi="Arial" w:cs="Arial"/>
+          <w:sz w:val="24"/>
+          <w:szCs w:val="24"/>
+        </w:rPr>
+      </w:pPr>
+      <w:r>
+        <w:rPr>
+          <w:rFonts w:ascii="Arial" w:hAnsi="Arial" w:cs="Arial"/>
+          <w:sz w:val="24"/>
+          <w:szCs w:val="24"/>
+        </w:rPr>
+        <w:t>El sistema permitirá automatizar el proceso de afiliación, el registro de pagos, la administración de grupos familiares y la asignación de espacios funerarios, mejorando la organización interna y la atención a los clientes.</w:t>
+      </w:r>
+    </w:p>
+    <w:p>
+      <w:pPr>
+        <w:spacing w:line="360" w:lineRule="auto"/>
+        <w:jc w:val="both"/>
+        <w:rPr>
+          <w:rFonts w:ascii="Arial" w:hAnsi="Arial" w:cs="Arial"/>
+          <w:sz w:val="24"/>
+          <w:szCs w:val="24"/>
+        </w:rPr>
+      </w:pPr>
+    </w:p>
+    <w:p>
+      <w:pPr>
+        <w:spacing w:line="360" w:lineRule="auto"/>
+        <w:jc w:val="both"/>
         <w:rPr>
           <w:rFonts w:ascii="Arial" w:hAnsi="Arial" w:cs="Arial"/>
           <w:b/>
@@ -163,122 +211,54 @@
           <w:sz w:val="24"/>
           <w:szCs w:val="24"/>
         </w:rPr>
-        <w:t xml:space="preserve"> del producto.</w:t>
-      </w:r>
-    </w:p>
-    <w:p>
-      <w:pPr>
-        <w:spacing w:line="360" w:lineRule="auto"/>
-        <w:jc w:val="both"/>
-        <w:rPr>
-          <w:rFonts w:ascii="Arial" w:hAnsi="Arial" w:cs="Arial"/>
-          <w:sz w:val="24"/>
-          <w:szCs w:val="24"/>
-        </w:rPr>
-      </w:pPr>
-      <w:r>
-        <w:rPr>
-          <w:rFonts w:ascii="Arial" w:hAnsi="Arial" w:cs="Arial"/>
-          <w:sz w:val="24"/>
-          <w:szCs w:val="24"/>
-        </w:rPr>
-        <w:t>La solución informativa desarrollada para la empresa de servicios fúnebres "El buen descanso" está diseñada para administrar eficientemente la afiliación de socios, el manejo de grupos familiares, la gestión de espacios funerarios y el seguimiento de los pagos mensuales.</w:t>
-      </w:r>
-    </w:p>
-    <w:p>
-      <w:pPr>
-        <w:spacing w:line="360" w:lineRule="auto"/>
-        <w:jc w:val="both"/>
-        <w:rPr>
-          <w:rFonts w:ascii="Arial" w:hAnsi="Arial" w:cs="Arial"/>
-          <w:sz w:val="24"/>
-          <w:szCs w:val="24"/>
-        </w:rPr>
-      </w:pPr>
-    </w:p>
-    <w:p>
-      <w:pPr>
-        <w:spacing w:line="360" w:lineRule="auto"/>
-        <w:jc w:val="both"/>
-        <w:rPr>
-          <w:rFonts w:ascii="Arial" w:hAnsi="Arial" w:cs="Arial"/>
-          <w:sz w:val="24"/>
-          <w:szCs w:val="24"/>
-        </w:rPr>
-      </w:pPr>
-      <w:r>
-        <w:rPr>
-          <w:rFonts w:ascii="Arial" w:hAnsi="Arial" w:cs="Arial"/>
-          <w:sz w:val="24"/>
-          <w:szCs w:val="24"/>
-        </w:rPr>
-        <w:t xml:space="preserve">El sistema </w:t>
-      </w:r>
-      <w:proofErr w:type="gramStart"/>
-      <w:r>
-        <w:rPr>
-          <w:rFonts w:ascii="Arial" w:hAnsi="Arial" w:cs="Arial"/>
-          <w:sz w:val="24"/>
-          <w:szCs w:val="24"/>
-        </w:rPr>
-        <w:t>le</w:t>
-      </w:r>
-      <w:proofErr w:type="gramEnd"/>
-      <w:r>
-        <w:rPr>
-          <w:rFonts w:ascii="Arial" w:hAnsi="Arial" w:cs="Arial"/>
-          <w:sz w:val="24"/>
-          <w:szCs w:val="24"/>
-        </w:rPr>
-        <w:t xml:space="preserve"> permitirá a los socios solicitar su afiliación a través de un formulario web, que será evaluado por un administrador antes de su aprobación. A continuación, el sistema registrará al nuevo socio, quien tendrá que pagar la afiliación. Tras comprobar el pago, el sistema asignará un espacio funerario compatible con sus preferencias (parcela, panteón o nicho), según sus demandas.</w:t>
-      </w:r>
-    </w:p>
-    <w:p>
-      <w:pPr>
-        <w:spacing w:line="360" w:lineRule="auto"/>
-        <w:jc w:val="both"/>
-        <w:rPr>
-          <w:rFonts w:ascii="Arial" w:hAnsi="Arial" w:cs="Arial"/>
-          <w:sz w:val="24"/>
-          <w:szCs w:val="24"/>
-        </w:rPr>
-      </w:pPr>
-    </w:p>
-    <w:p>
-      <w:pPr>
-        <w:spacing w:line="360" w:lineRule="auto"/>
-        <w:jc w:val="both"/>
-        <w:rPr>
-          <w:rFonts w:ascii="Arial" w:hAnsi="Arial" w:cs="Arial"/>
-          <w:sz w:val="24"/>
-          <w:szCs w:val="24"/>
-        </w:rPr>
-      </w:pPr>
-      <w:r>
-        <w:rPr>
-          <w:rFonts w:ascii="Arial" w:hAnsi="Arial" w:cs="Arial"/>
-          <w:sz w:val="24"/>
-          <w:szCs w:val="24"/>
-        </w:rPr>
-        <w:t xml:space="preserve">Además, la </w:t>
-      </w:r>
-      <w:proofErr w:type="gramStart"/>
-      <w:r>
-        <w:rPr>
-          <w:rFonts w:ascii="Arial" w:hAnsi="Arial" w:cs="Arial"/>
-          <w:sz w:val="24"/>
-          <w:szCs w:val="24"/>
-        </w:rPr>
-        <w:t>app</w:t>
-      </w:r>
-      <w:proofErr w:type="gramEnd"/>
-      <w:r>
-        <w:rPr>
-          <w:rFonts w:ascii="Arial" w:hAnsi="Arial" w:cs="Arial"/>
-          <w:sz w:val="24"/>
-          <w:szCs w:val="24"/>
-        </w:rPr>
-        <w:t xml:space="preserve"> facilitará a los socios que busquen información en un portal web donde puedan revisar sus detalles personales, los miembros de su grupo familiar y otros elementos vinculados a su afiliación. En consecuencia, se logrará la mejora de los procedimientos administrativos, la mejor organización de la información y una atención más ágil del servicio de "El buen descanso".</w:t>
+      </w:pPr>
+      <w:r>
+        <w:rPr>
+          <w:rFonts w:ascii="Arial" w:hAnsi="Arial" w:cs="Arial"/>
+          <w:b/>
+          <w:bCs/>
+          <w:sz w:val="24"/>
+          <w:szCs w:val="24"/>
+        </w:rPr>
+        <w:t>Alcance</w:t>
+      </w:r>
+    </w:p>
+    <w:p>
+      <w:pPr>
+        <w:spacing w:line="360" w:lineRule="auto"/>
+        <w:jc w:val="both"/>
+        <w:rPr>
+          <w:rFonts w:ascii="Arial" w:hAnsi="Arial" w:cs="Arial"/>
+          <w:sz w:val="24"/>
+          <w:szCs w:val="24"/>
+        </w:rPr>
+      </w:pPr>
+      <w:r>
+        <w:rPr>
+          <w:rFonts w:ascii="Arial" w:hAnsi="Arial" w:cs="Arial"/>
+          <w:sz w:val="24"/>
+          <w:szCs w:val="24"/>
+        </w:rPr>
+        <w:t>El sistema permitirá gestionar todo el proceso de afiliación de nuevos socios, desde la solicitud inicial hasta su aprobación. Además, posibilitará registrar pagos mensuales, administrar grupos familiares, controlar la disponibilidad de espacios funerarios y brindar a los socios un portal donde podrán consultar su información personal y el estado de su afiliación.</w:t>
+      </w:r>
+    </w:p>
+    <w:p>
+      <w:pPr>
+        <w:spacing w:line="360" w:lineRule="auto"/>
+        <w:jc w:val="both"/>
+        <w:rPr>
+          <w:rFonts w:ascii="Arial" w:hAnsi="Arial" w:cs="Arial"/>
+          <w:sz w:val="24"/>
+          <w:szCs w:val="24"/>
+        </w:rPr>
+      </w:pPr>
+      <w:r>
+        <w:rPr>
+          <w:rFonts w:ascii="Arial" w:hAnsi="Arial" w:cs="Arial"/>
+          <w:sz w:val="24"/>
+          <w:szCs w:val="24"/>
+        </w:rPr>
+        <w:t>La aplicación estará destinada al personal administrativo de la empresa y a los socios registrados, permitiendo un acceso seguro según el tipo de usuario.</w:t>
       </w:r>
     </w:p>
     <w:p>
@@ -4025,6 +4005,7 @@
                 <w:szCs w:val="24"/>
               </w:rPr>
             </w:pPr>
+            <w:proofErr w:type="spellStart"/>
             <w:r>
               <w:rPr>
                 <w:rFonts w:ascii="Arial" w:hAnsi="Arial" w:cs="Arial"/>
@@ -4033,6 +4014,7 @@
               </w:rPr>
               <w:t>Sys_Log</w:t>
             </w:r>
+            <w:proofErr w:type="spellEnd"/>
           </w:p>
         </w:tc>
         <w:tc>
@@ -12806,7 +12788,6 @@
   <w:style w:type="character" w:default="1" w:styleId="Fuentedeprrafopredeter">
     <w:name w:val="Default Paragraph Font"/>
     <w:uiPriority w:val="1"/>
-    <w:semiHidden/>
     <w:unhideWhenUsed/>
   </w:style>
   <w:style w:type="table" w:default="1" w:styleId="Tablanormal">

</xml_diff>